<commit_message>
feat: Phase 11 MCP server + Phase 12 AWS Bedrock Knowledge Base (built, tested, documented, cleaned up)
</commit_message>
<xml_diff>
--- a/Project_all_observations_docs/mcp.docx
+++ b/Project_all_observations_docs/mcp.docx
@@ -152,6 +152,332 @@
             </a:graphic>
           </wp:inline>
         </w:drawing>
+      </w:r>
+    </w:p>
+    <w:p/>
+    <w:p>
+      <w:r>
+        <w:t xml:space="preserve">                USER</w:t>
+      </w:r>
+    </w:p>
+    <w:p>
+      <w:r>
+        <w:t xml:space="preserve">                 │</w:t>
+      </w:r>
+    </w:p>
+    <w:p>
+      <w:r>
+        <w:t xml:space="preserve">                 │ question</w:t>
+      </w:r>
+    </w:p>
+    <w:p>
+      <w:r>
+        <w:t xml:space="preserve">                 </w:t>
+      </w:r>
+      <w:r>
+        <w:rPr>
+          <w:rFonts w:ascii="Arial" w:hAnsi="Arial" w:cs="Arial"/>
+        </w:rPr>
+        <w:t>▼</w:t>
+      </w:r>
+    </w:p>
+    <w:p>
+      <w:r>
+        <w:t xml:space="preserve">        ┌─────────────────┐</w:t>
+      </w:r>
+    </w:p>
+    <w:p>
+      <w:r>
+        <w:t xml:space="preserve">        │   AI Client     │</w:t>
+      </w:r>
+    </w:p>
+    <w:p>
+      <w:r>
+        <w:t xml:space="preserve">        │ (MCP-compatible)│</w:t>
+      </w:r>
+    </w:p>
+    <w:p>
+      <w:r>
+        <w:t xml:space="preserve">        └────────</w:t>
+      </w:r>
+      <w:r>
+        <w:rPr>
+          <w:rFonts w:ascii="MS Gothic" w:eastAsia="MS Gothic" w:hAnsi="MS Gothic" w:cs="MS Gothic" w:hint="eastAsia"/>
+        </w:rPr>
+        <w:t>┬</w:t>
+      </w:r>
+      <w:r>
+        <w:rPr>
+          <w:rFonts w:ascii="Calibri" w:hAnsi="Calibri" w:cs="Calibri"/>
+        </w:rPr>
+        <w:t>────────┘</w:t>
+      </w:r>
+    </w:p>
+    <w:p>
+      <w:r>
+        <w:t xml:space="preserve">                 │</w:t>
+      </w:r>
+    </w:p>
+    <w:p>
+      <w:r>
+        <w:t xml:space="preserve">                 │ MCP request</w:t>
+      </w:r>
+    </w:p>
+    <w:p>
+      <w:r>
+        <w:t xml:space="preserve">                 </w:t>
+      </w:r>
+      <w:r>
+        <w:rPr>
+          <w:rFonts w:ascii="Arial" w:hAnsi="Arial" w:cs="Arial"/>
+        </w:rPr>
+        <w:t>▼</w:t>
+      </w:r>
+    </w:p>
+    <w:p>
+      <w:r>
+        <w:t xml:space="preserve">        ┌─────────────────┐</w:t>
+      </w:r>
+    </w:p>
+    <w:p>
+      <w:r>
+        <w:t xml:space="preserve">        │   MCP Server    │</w:t>
+      </w:r>
+    </w:p>
+    <w:p>
+      <w:r>
+        <w:t xml:space="preserve">        │ clinical-       │</w:t>
+      </w:r>
+    </w:p>
+    <w:p>
+      <w:r>
+        <w:t xml:space="preserve">        │ intelligence    │</w:t>
+      </w:r>
+    </w:p>
+    <w:p>
+      <w:r>
+        <w:lastRenderedPageBreak/>
+        <w:t xml:space="preserve">        └────────</w:t>
+      </w:r>
+      <w:r>
+        <w:rPr>
+          <w:rFonts w:ascii="MS Gothic" w:eastAsia="MS Gothic" w:hAnsi="MS Gothic" w:cs="MS Gothic" w:hint="eastAsia"/>
+        </w:rPr>
+        <w:t>┬</w:t>
+      </w:r>
+      <w:r>
+        <w:rPr>
+          <w:rFonts w:ascii="Calibri" w:hAnsi="Calibri" w:cs="Calibri"/>
+        </w:rPr>
+        <w:t>────────┘</w:t>
+      </w:r>
+    </w:p>
+    <w:p>
+      <w:r>
+        <w:t xml:space="preserve">                 │</w:t>
+      </w:r>
+    </w:p>
+    <w:p>
+      <w:r>
+        <w:t xml:space="preserve">                 │ call tool</w:t>
+      </w:r>
+    </w:p>
+    <w:p>
+      <w:r>
+        <w:t xml:space="preserve">                 </w:t>
+      </w:r>
+      <w:r>
+        <w:rPr>
+          <w:rFonts w:ascii="Arial" w:hAnsi="Arial" w:cs="Arial"/>
+        </w:rPr>
+        <w:t>▼</w:t>
+      </w:r>
+    </w:p>
+    <w:p>
+      <w:r>
+        <w:t xml:space="preserve">   </w:t>
+      </w:r>
+      <w:proofErr w:type="spellStart"/>
+      <w:r>
+        <w:t>search_clinical_documents</w:t>
+      </w:r>
+      <w:proofErr w:type="spellEnd"/>
+      <w:r>
+        <w:t>()</w:t>
+      </w:r>
+    </w:p>
+    <w:p>
+      <w:r>
+        <w:t xml:space="preserve">                 │</w:t>
+      </w:r>
+    </w:p>
+    <w:p>
+      <w:r>
+        <w:t xml:space="preserve">                 </w:t>
+      </w:r>
+      <w:r>
+        <w:rPr>
+          <w:rFonts w:ascii="Arial" w:hAnsi="Arial" w:cs="Arial"/>
+        </w:rPr>
+        <w:t>▼</w:t>
+      </w:r>
+    </w:p>
+    <w:p>
+      <w:r>
+        <w:t xml:space="preserve">        </w:t>
+      </w:r>
+      <w:proofErr w:type="spellStart"/>
+      <w:r>
+        <w:t>RetrievalService</w:t>
+      </w:r>
+      <w:proofErr w:type="spellEnd"/>
+    </w:p>
+    <w:p>
+      <w:r>
+        <w:t xml:space="preserve">                 │</w:t>
+      </w:r>
+    </w:p>
+    <w:p>
+      <w:r>
+        <w:t xml:space="preserve">          ┌──────</w:t>
+      </w:r>
+      <w:r>
+        <w:rPr>
+          <w:rFonts w:ascii="MS Gothic" w:eastAsia="MS Gothic" w:hAnsi="MS Gothic" w:cs="MS Gothic" w:hint="eastAsia"/>
+        </w:rPr>
+        <w:t>┴</w:t>
+      </w:r>
+      <w:r>
+        <w:rPr>
+          <w:rFonts w:ascii="Calibri" w:hAnsi="Calibri" w:cs="Calibri"/>
+        </w:rPr>
+        <w:t>──────┐</w:t>
+      </w:r>
+    </w:p>
+    <w:p>
+      <w:r>
+        <w:t xml:space="preserve">          </w:t>
+      </w:r>
+      <w:r>
+        <w:rPr>
+          <w:rFonts w:ascii="Arial" w:hAnsi="Arial" w:cs="Arial"/>
+        </w:rPr>
+        <w:t>▼</w:t>
+      </w:r>
+      <w:r>
+        <w:t xml:space="preserve">             </w:t>
+      </w:r>
+      <w:r>
+        <w:rPr>
+          <w:rFonts w:ascii="Arial" w:hAnsi="Arial" w:cs="Arial"/>
+        </w:rPr>
+        <w:t>▼</w:t>
+      </w:r>
+    </w:p>
+    <w:p>
+      <w:r>
+        <w:t xml:space="preserve">      Embeddings     Vector Store</w:t>
+      </w:r>
+    </w:p>
+    <w:p>
+      <w:r>
+        <w:t xml:space="preserve">          │             │</w:t>
+      </w:r>
+    </w:p>
+    <w:p>
+      <w:r>
+        <w:t xml:space="preserve">          └──────</w:t>
+      </w:r>
+      <w:r>
+        <w:rPr>
+          <w:rFonts w:ascii="MS Gothic" w:eastAsia="MS Gothic" w:hAnsi="MS Gothic" w:cs="MS Gothic" w:hint="eastAsia"/>
+        </w:rPr>
+        <w:t>┬</w:t>
+      </w:r>
+      <w:r>
+        <w:rPr>
+          <w:rFonts w:ascii="Calibri" w:hAnsi="Calibri" w:cs="Calibri"/>
+        </w:rPr>
+        <w:t>──────┘</w:t>
+      </w:r>
+    </w:p>
+    <w:p>
+      <w:r>
+        <w:t xml:space="preserve">                 </w:t>
+      </w:r>
+      <w:r>
+        <w:rPr>
+          <w:rFonts w:ascii="Arial" w:hAnsi="Arial" w:cs="Arial"/>
+        </w:rPr>
+        <w:t>▼</w:t>
+      </w:r>
+    </w:p>
+    <w:p>
+      <w:r>
+        <w:t xml:space="preserve">        Relevant documents</w:t>
+      </w:r>
+    </w:p>
+    <w:p>
+      <w:r>
+        <w:t xml:space="preserve">                 │</w:t>
+      </w:r>
+    </w:p>
+    <w:p>
+      <w:r>
+        <w:t xml:space="preserve">                 </w:t>
+      </w:r>
+      <w:r>
+        <w:rPr>
+          <w:rFonts w:ascii="Arial" w:hAnsi="Arial" w:cs="Arial"/>
+        </w:rPr>
+        <w:t>▼</w:t>
+      </w:r>
+    </w:p>
+    <w:p>
+      <w:r>
+        <w:t xml:space="preserve">           MCP Server</w:t>
+      </w:r>
+    </w:p>
+    <w:p>
+      <w:r>
+        <w:t xml:space="preserve">                 │</w:t>
+      </w:r>
+    </w:p>
+    <w:p>
+      <w:r>
+        <w:t xml:space="preserve">                 </w:t>
+      </w:r>
+      <w:r>
+        <w:rPr>
+          <w:rFonts w:ascii="Arial" w:hAnsi="Arial" w:cs="Arial"/>
+        </w:rPr>
+        <w:t>▼</w:t>
+      </w:r>
+    </w:p>
+    <w:p>
+      <w:r>
+        <w:t xml:space="preserve">            AI Client</w:t>
+      </w:r>
+    </w:p>
+    <w:p>
+      <w:r>
+        <w:t xml:space="preserve">                 │</w:t>
+      </w:r>
+    </w:p>
+    <w:p>
+      <w:r>
+        <w:t xml:space="preserve">                 </w:t>
+      </w:r>
+      <w:r>
+        <w:rPr>
+          <w:rFonts w:ascii="Arial" w:hAnsi="Arial" w:cs="Arial"/>
+        </w:rPr>
+        <w:t>▼</w:t>
+      </w:r>
+    </w:p>
+    <w:p>
+      <w:r>
+        <w:t xml:space="preserve">              USER</w:t>
       </w:r>
     </w:p>
     <w:sectPr>

</xml_diff>